<commit_message>
Keep Session 01 on incident/; move the project in a Lesson 02 prompt
lesson-00 and lesson-01 go back to their incident/ commits, and every Session 01
prompt, page, deck slide, guide and content document is as it was before the
restructure. Lesson 02 now starts with one extra prompt, "Move to the course
layout", that moves a learner's project into agent_runtime/ and course/ (still
7 passed) before the check pack adds the platform in agentic_platform/.

The guide builder supports the optional layout_prompt (Lesson 02 has 14 prompts),
and the kit maps given files and checks to the incident/ layout for Lesson 01.

Co-Authored-By: Claude Opus 5.5 <noreply@anthropic.com>
Claude-Session: https://claude.ai/code/session_0123W63ZaDAAnYHCFqarTnbL
</commit_message>
<xml_diff>
--- a/L3 2026 Agentic Platform Instructor Materials/content-development/02 Reliable tools and MCP integration - content development.docx
+++ b/L3 2026 Agentic Platform Instructor Materials/content-development/02 Reliable tools and MCP integration - content development.docx
@@ -3176,7 +3176,7 @@
         <w:rPr>
           <w:color w:val="1F4E79"/>
         </w:rPr>
-        <w:t>• Finish any prompt you did not complete in class, in order: Prepare, Add the check pack, Build steps 1–4, the exercise, Verify and push, and Review.</w:t>
+        <w:t>• Finish any prompt you did not complete in class, in order: Prepare, Move to the course layout, Add the check pack, Build steps 1–4, the exercise, Verify and push, and Review.</w:t>
       </w:r>
     </w:p>
     <w:p>
@@ -4911,7 +4911,7 @@
         <w:rPr>
           <w:color w:val="1F4E79"/>
         </w:rPr>
-        <w:t>Start from your Session 01 checkpoint. Run the prompts on the Session 02 page in order (Prepare, Add the check pack, Build steps 1–4, the exercise, Verify and push, Review); the same prompts are in LEARNER_PROMPTS.md (Lesson 02). No paid model account is needed.</w:t>
+        <w:t>Start from your Session 01 checkpoint. Run the prompts on the Session 02 page in order (Prepare, Move to the course layout, Add the check pack, Build steps 1–4, the exercise, Verify and push, Review); the same prompts are in LEARNER_PROMPTS.md (Lesson 02). No paid model account is needed.</w:t>
       </w:r>
     </w:p>
     <w:p>

</xml_diff>

<commit_message>
Session 02 content document: the move-and-start prompt, project layout, first-start screenshots
Co-Authored-By: Claude Opus 5.5 <noreply@anthropic.com>
Claude-Session: https://claude.ai/code/session_0123W63ZaDAAnYHCFqarTnbL
</commit_message>
<xml_diff>
--- a/L3 2026 Agentic Platform Instructor Materials/content-development/02 Reliable tools and MCP integration - content development.docx
+++ b/L3 2026 Agentic Platform Instructor Materials/content-development/02 Reliable tools and MCP integration - content development.docx
@@ -1537,7 +1537,7 @@
               <w:rPr>
                 <w:color w:val="1F4E79"/>
               </w:rPr>
-              <w:t>Reconnect to INC-001 and your Session 01 checkpoint; open your platform's first console</w:t>
+              <w:t>Reconnect to INC-001 and your Session 01 checkpoint; one prompt moves your project to the course layout and starts your platform's first console</w:t>
             </w:r>
           </w:p>
         </w:tc>
@@ -2941,6 +2941,25 @@
           <w:b/>
           <w:color w:val="1F4E79"/>
         </w:rPr>
+        <w:t xml:space="preserve">0. Live demo: move to the course layout and start the platform. </w:t>
+      </w:r>
+      <w:r>
+        <w:rPr>
+          <w:color w:val="1F4E79"/>
+        </w:rPr>
+        <w:t>Purpose: give each component its own folder in source control and make the platform visible before anything is built. Instructions: run the first Session 02 prompt; the agent moves the runtime into agent_runtime/ and the course scaffolding into course/ (still 7 tests passing), copies the given platform shell into agentic_platform/ (each as its own commit) and starts the platform on loopback. Learners sign in as demo-astro, submit INC-001 in Runs and open Tools. Time: 5 min, within section 1. Expected outcome: the platform map at checkpoint lesson-01, INC-001 answered with cited evidence by their own Session 01 agent, and a Tools view saying the tool boundary is not built yet. Debrief: what should this view show once today's boundary exists?</w:t>
+      </w:r>
+    </w:p>
+    <w:p>
+      <w:pPr>
+        <w:spacing w:after="200" w:lineRule="auto"/>
+        <w:ind w:left="0" w:firstLine="0"/>
+      </w:pPr>
+      <w:r>
+        <w:rPr>
+          <w:b/>
+          <w:color w:val="1F4E79"/>
+        </w:rPr>
         <w:t xml:space="preserve">1. Discussion: the most consequential line. </w:t>
       </w:r>
       <w:r>
@@ -3478,7 +3497,7 @@
         <w:rPr>
           <w:color w:val="1F4E79"/>
         </w:rPr>
-        <w:t>• 2. From today your platform has a console: the given run API and console, with screenshots of the Tools and Runs views.</w:t>
+        <w:t>• 2. From today your platform has a console: the given run API and console, copied into agentic_platform/ and started by the first prompt, with screenshots of its first start and of the Tools and Runs views.</w:t>
       </w:r>
     </w:p>
     <w:p>
@@ -5578,7 +5597,7 @@
           <w:b/>
           <w:color w:val="1F4E79"/>
         </w:rPr>
-        <w:t xml:space="preserve">  ✔ the console's Tools and Runs views on the Session 02 page</w:t>
+        <w:t xml:space="preserve">  ✔ the console's first start (Overview at checkpoint lesson-01, Tools before the boundary exists) and its Tools and Runs views after the build, on the Session 02 page</w:t>
       </w:r>
     </w:p>
     <w:p>
@@ -5978,6 +5997,18 @@
     </w:p>
     <w:p>
       <w:pPr>
+        <w:spacing w:after="200" w:lineRule="auto"/>
+        <w:ind w:left="432" w:firstLine="0"/>
+      </w:pPr>
+      <w:r>
+        <w:rPr>
+          <w:color w:val="1F4E79"/>
+        </w:rPr>
+        <w:t>• Project layout from Session 02: agent_runtime/ holds the agent runtime learners build (Sessions 01–07), agentic_platform/ holds the platform (the given shell now; registry, gateway, identity and operations later), course/ holds the course scaffolding (LESSON, the lab runner and demos, given data) and tests/ the checks. Session 01 projects keep everything in incident/ until the first Session 02 prompt moves them.</w:t>
+      </w:r>
+    </w:p>
+    <w:p>
+      <w:pPr>
         <w:pStyle w:val="Heading2"/>
         <w:keepNext w:val="0"/>
         <w:keepLines w:val="0"/>
@@ -6271,7 +6302,7 @@
         <w:rPr>
           <w:color w:val="1F4E79"/>
         </w:rPr>
-        <w:t>• The given platform shell keeps runs in memory, so they are lost when the process restarts; Session 05 makes runs durable and Session 08 replaces the shell with the platform core. A Tools check in the console never approves a write.</w:t>
+        <w:t>• The given platform shell keeps runs in memory, so they are lost when the process restarts; Session 05 makes runs durable and Session 08 replaces the shell with the platform core. Until build steps 1 and 2 add ToolExecutor, the shell runs the Session 01 readers with no boundary in front of them and the Tools view says so. A Tools check in the console never approves a write.</w:t>
       </w:r>
     </w:p>
     <w:p>

</xml_diff>